<commit_message>
Harden final-round quality risk closure
</commit_message>
<xml_diff>
--- a/提交材料/01_开题报告.docx
+++ b/提交材料/01_开题报告.docx
@@ -327,7 +327,7 @@
         <w:pStyle w:val="BodyText"/>
       </w:pPr>
       <w:r>
-        <w:t xml:space="preserve">公开资料显示，赛力斯超级工厂已经具备全价值链质量数据采集、异常特征自动提取、控线、异常设备定位和一车一档能力。华为智慧园区案例进一步说明，AI、联接、计算、存储、云和数字能源共同支撑生产网络、AIoT检测、数字班组和全过程质量数据采集。也就是说，赛题不是从零开始做“数据化”，而是在现有智能制造基础上继续前进一步：把已有数据资产转化为主动风险管控能力。</w:t>
+        <w:t xml:space="preserve">赛力斯2025年年度报告披露工业AI大模型、行业首创智能连接工艺系统和36,000+质量点位全自动实时监控，并强调“信息—决策—行动”闭环。结合一车一档、异常设备定位和全价值链质量数据基础，赛题不是从零开始做数据化，而是把已有点位、档案和知识转化为主动风险管控能力。</w:t>
       </w:r>
     </w:p>
     <w:p>
@@ -433,7 +433,7 @@
         <w:pStyle w:val="BodyText"/>
       </w:pPr>
       <w:r>
-        <w:t xml:space="preserve">中层是GraphRAG和因果护栏。GraphRAG不只检索文档片段，而是先沿图谱路径收敛上下文，再从SOP、FMEA、历史8D、维修记录和检测规范中提取证据。因果护栏负责约束方向和边界，例如后续检测缺陷不能反向解释前序设备参数，设备维修记录只能影响维修后的时间窗，批次风险必须通过零件绑定关系映射到VIN。</w:t>
+        <w:t xml:space="preserve">中层是GraphRAG和因果护栏。生产形态先沿图谱路径收敛上下文，再从SOP、FMEA、历史8D、维修记录和检测规范中提取证据；当前作品以28个实例节点、24条关系边和带来源片段的有界关系路径检索验证机制，企业文档索引和图数据库在试点阶段接入。因果护栏负责约束方向和边界，例如后续检测缺陷不能反向解释前序设备参数，设备维修记录只能影响维修后的时间窗，批次风险必须通过零件绑定关系映射到VIN。</w:t>
       </w:r>
     </w:p>
     <w:p>
@@ -553,7 +553,7 @@
         <w:pStyle w:val="BodyText"/>
       </w:pPr>
       <w:r>
-        <w:t xml:space="preserve">整体架构分为六层。第一层为数据接入层，接入MES、QMS、SCADA/PLC、视觉检测、设备点检、维修记录、FMEA、控制计划和飞书任务状态。第二层为质量知识底座层，基于本体论建立设备、工位、工序、参数、质量特性、缺陷模式、根因和处置任务之间的关系。第三层为风险识别层，结合工艺窗口、SPC趋势、连续性、设备寿命、批次范围和历史案例进行P1/P2/P3分级。第四层为GraphRAG推理层，沿图谱路径检索FMEA、SOP、维修记录、质检规范和历史8D，生成可验证证据链。第五层为Agent执行层，完成观察、研判、检索、推理、行动和复盘。第六层为飞书协同层，通过Aily、多维表格和机器人卡片承接任务流转。</w:t>
+        <w:t xml:space="preserve">整体架构分为七层：现场与边缘层只读接入MES、QMS、SCADA/PLC、视觉检测和设备点检；事件与数据质量层执行Schema、序列、时钟、量纲、校准和对象绑定准入；质量知识底座层建立设备、工位、参数、质量特性、缺陷模式和任务关系；风险检测层组合工艺窗口、EWMA、CUSUM、残差和设备寿命；GraphRAG与因果保障层执行受约束检索、Top-3和反事实更新；Agent与策略层控制状态机、模式权限和关闭条件；飞书与治理层承接Base、任务、审批、文档、事件订阅与审计。</w:t>
       </w:r>
     </w:p>
     <w:p>
@@ -739,20 +739,20 @@
         <w:pStyle w:val="BodyText"/>
       </w:pPr>
       <w:r>
-        <w:t xml:space="preserve">作品已从概念架构推进到可运行链路。互动工作台包含产线态势、事件队列、数字员工身份、弱信号与缺陷显性化前置量、GraphRAG路径、Top-3假设、反事实验证、一车一因果链、决策前因果护栏、关闭前确定性门、三态运行模式、责任链、故障降级、飞书执行轨迹和跨工序复制矩阵。四类工况的前置量由带时间戳序列实际运行EWMA/CUSUM并计算，不从页面文案读取；干预结果会更新候选根因后验排序，缺少干预证据和实名确认时关闭按钮保持禁用。</w:t>
-      </w:r>
-    </w:p>
-    <w:p>
-      <w:r>
-        <w:t xml:space="preserve"/>
-      </w:r>
-    </w:p>
-    <w:p>
-      <w:pPr>
-        <w:pStyle w:val="BodyText"/>
-      </w:pPr>
-      <w:r>
-        <w:t xml:space="preserve">飞书在线链路已完成用户身份授权、Base解析、13字段质量事件表创建、记录写入和读取回验。事件`CASE-TQ-20260719-01`已使用同一幂等键创建飞书任务`f10d51e5-cc8e-4c71-9441-cd29a77feacf`，并生成嵌入该任务的复盘文档`PjludNq8foBhkrxV8VQccsldneb`。这条链路证明质量事件可以从结构化台账进入责任任务，再进入复盘知识，而不是停留在网页演示。</w:t>
+        <w:t xml:space="preserve">作品已从概念架构推进到可运行链路。互动工作台包含动态产线态势、回放时钟、回答依据、弱信号与缺陷显性化前置量、关系图路径、稳定H编号与Rank重排、反事实验证、一车一因果链、独立五门关闭、故障降级、六对象飞书执行轨迹和生产试点就绪门。四类工况的前置量由带时间戳序列实际运行EWMA/CUSUM并计算；关闭动作只读取源数据、范围、物理复检、授权确认和任务/知识回写五项独立状态，不会反向制造通过结果。</w:t>
+      </w:r>
+    </w:p>
+    <w:p>
+      <w:r>
+        <w:t xml:space="preserve"/>
+      </w:r>
+    </w:p>
+    <w:p>
+      <w:pPr>
+        <w:pStyle w:val="BodyText"/>
+      </w:pPr>
+      <w:r>
+        <w:t xml:space="preserve">飞书能力采用分层核验：Base解析、13字段事件表、记录写入和读取回验已经在线完成；事件`CASE-TQ-20260719-01`保留任务与复盘文档对象样例；机器人卡片、Aily、原生审批、企业角色映射和事件消费者列为生产部署项。该口径既证明协同对象可形成，也不把对象样例等同于六表自动闭环现网运行。</w:t>
       </w:r>
     </w:p>
     <w:p>
@@ -1478,7 +1478,7 @@
         <w:pStyle w:val="BodyText"/>
       </w:pPr>
       <w:r>
-        <w:t xml:space="preserve">方案依据赛力斯集团2024年年度报告、2025年半年度报告和2024年ESG报告；技术依据包括电动车制造交互式根因分析、Root-KGD、Document GraphRAG和反事实根因分析；制造架构与治理依据包括ISO 23247、OPC UA for ISA-95、AIAG Control Plan、NIST AI RMF和NIST SP 800-82 Rev.3；飞书能力依据来自多维表格、任务、消息卡片、文档和事件订阅官方资料。完整目录和链接见`04_参考文献与数据依据`。</w:t>
+        <w:t xml:space="preserve">方案依据赛力斯集团2025年年度报告、2024年年度报告、2025年半年度报告和2024年ESG报告；技术依据包括电动车制造交互式根因分析、Root-KGD、Document GraphRAG和反事实根因分析；制造架构与治理依据包括ISO 23247、OPC UA for ISA-95、AIAG Control Plan、NIST AI RMF和NIST SP 800-82 Rev.3；飞书能力依据来自多维表格、任务、消息卡片、文档、工作流和事件订阅官方资料。完整目录和链接见`04_参考文献与数据依据`。</w:t>
       </w:r>
     </w:p>
     <w:sectPr>

</xml_diff>

<commit_message>
Final submission audit and consistency fixes
</commit_message>
<xml_diff>
--- a/提交材料/01_开题报告.docx
+++ b/提交材料/01_开题报告.docx
@@ -446,7 +446,7 @@
         <w:pStyle w:val="BodyText"/>
       </w:pPr>
       <w:r>
-        <w:t xml:space="preserve">中层是GraphRAG和因果护栏。生产形态先沿图谱路径收敛上下文，再从SOP、FMEA、历史8D、维修记录和检测规范中提取证据；当前作品以36个实例节点、32条关系边和带来源片段的有界路径验证两类检索：实时事件沿设备—参数—质量—车辆路径圈定影响，知识债事件沿实例—类型—功能—同类设备—工单—故障模式路径迁移证据。候选只生成检查任务，不能自动成为根因或主数据关系。</w:t>
+        <w:t xml:space="preserve">中层是GraphRAG和因果护栏。生产形态先沿图谱路径收敛上下文，再从SOP、FMEA、历史8D、维修记录和检测规范中提取证据；当前作品以36个图谱节点、32条关系边和带来源片段的有界路径验证两类检索：实时事件沿设备—参数—质量—车辆路径圈定影响，知识债事件沿实例—类型—功能—同类设备—工单—故障模式路径迁移证据。候选只生成检查任务，不能自动成为根因或主数据关系。</w:t>
       </w:r>
     </w:p>
     <w:p>
@@ -1014,7 +1014,7 @@
           </w:tcPr>
           <w:p>
             <w:r>
-              <w:t xml:space="preserve">历史回放与影子运行重大风险事件</w:t>
+              <w:t xml:space="preserve">被系统识别且经现场确认的P1/全部现场确认P1，按周盲测</w:t>
             </w:r>
           </w:p>
         </w:tc>

</xml_diff>